<commit_message>
ADDING TODAY'S WORK - 17.06.2026
</commit_message>
<xml_diff>
--- a/write_up/drafts/6_references/reference_list.docx
+++ b/write_up/drafts/6_references/reference_list.docx
@@ -1,6 +1,6 @@
 
 <file path=word/document.xml><?xml version="1.0" encoding="utf-8"?>
-<w:document xmlns:wpc="http://schemas.microsoft.com/office/word/2010/wordprocessingCanvas" xmlns:cx="http://schemas.microsoft.com/office/drawing/2014/chartex" xmlns:cx1="http://schemas.microsoft.com/office/drawing/2015/9/8/chartex" xmlns:cx2="http://schemas.microsoft.com/office/drawing/2015/10/21/chartex" xmlns:cx3="http://schemas.microsoft.com/office/drawing/2016/5/9/chartex" xmlns:cx4="http://schemas.microsoft.com/office/drawing/2016/5/10/chartex" xmlns:cx5="http://schemas.microsoft.com/office/drawing/2016/5/11/chartex" xmlns:cx6="http://schemas.microsoft.com/office/drawing/2016/5/12/chartex" xmlns:cx7="http://schemas.microsoft.com/office/drawing/2016/5/13/chartex" xmlns:cx8="http://schemas.microsoft.com/office/drawing/2016/5/14/chartex" xmlns:mc="http://schemas.openxmlformats.org/markup-compatibility/2006" xmlns:aink="http://schemas.microsoft.com/office/drawing/2016/ink" xmlns:am3d="http://schemas.microsoft.com/office/drawing/2017/model3d" xmlns:o="urn:schemas-microsoft-com:office:office" xmlns:oel="http://schemas.microsoft.com/office/2019/extlst" xmlns:r="http://schemas.openxmlformats.org/officeDocument/2006/relationships" xmlns:m="http://schemas.openxmlformats.org/officeDocument/2006/math" xmlns:v="urn:schemas-microsoft-com:vml" xmlns:wp14="http://schemas.microsoft.com/office/word/2010/wordprocessingDrawing" xmlns:wp="http://schemas.openxmlformats.org/drawingml/2006/wordprocessingDrawing" xmlns:w10="urn:schemas-microsoft-com:office:word" xmlns:w="http://schemas.openxmlformats.org/wordprocessingml/2006/main" xmlns:w14="http://schemas.microsoft.com/office/word/2010/wordml" xmlns:w15="http://schemas.microsoft.com/office/word/2012/wordml" xmlns:w16cex="http://schemas.microsoft.com/office/word/2018/wordml/cex" xmlns:w16cid="http://schemas.microsoft.com/office/word/2016/wordml/cid" xmlns:w16="http://schemas.microsoft.com/office/word/2018/wordml" xmlns:w16du="http://schemas.microsoft.com/office/word/2023/wordml/word16du" xmlns:w16sdtdh="http://schemas.microsoft.com/office/word/2020/wordml/sdtdatahash" xmlns:w16sdtfl="http://schemas.microsoft.com/office/word/2024/wordml/sdtformatlock" xmlns:w16se="http://schemas.microsoft.com/office/word/2015/wordml/symex" xmlns:wpg="http://schemas.microsoft.com/office/word/2010/wordprocessingGroup" xmlns:wpi="http://schemas.microsoft.com/office/word/2010/wordprocessingInk" xmlns:wne="http://schemas.microsoft.com/office/word/2006/wordml" xmlns:wps="http://schemas.microsoft.com/office/word/2010/wordprocessingShape" mc:Ignorable="w14 w15 w16se w16cid w16 w16cex w16sdtdh w16sdtfl w16du wp14">
+<w:document xmlns:wpc="http://schemas.microsoft.com/office/word/2010/wordprocessingCanvas" xmlns:cx="http://schemas.microsoft.com/office/drawing/2014/chartex" xmlns:cx1="http://schemas.microsoft.com/office/drawing/2015/9/8/chartex" xmlns:cx2="http://schemas.microsoft.com/office/drawing/2015/10/21/chartex" xmlns:cx3="http://schemas.microsoft.com/office/drawing/2016/5/9/chartex" xmlns:cx4="http://schemas.microsoft.com/office/drawing/2016/5/10/chartex" xmlns:cx5="http://schemas.microsoft.com/office/drawing/2016/5/11/chartex" xmlns:cx6="http://schemas.microsoft.com/office/drawing/2016/5/12/chartex" xmlns:cx7="http://schemas.microsoft.com/office/drawing/2016/5/13/chartex" xmlns:cx8="http://schemas.microsoft.com/office/drawing/2016/5/14/chartex" xmlns:mc="http://schemas.openxmlformats.org/markup-compatibility/2006" xmlns:m="http://schemas.openxmlformats.org/officeDocument/2006/math" xmlns:aink="http://schemas.microsoft.com/office/drawing/2016/ink" xmlns:am3d="http://schemas.microsoft.com/office/drawing/2017/model3d" xmlns:oel="http://schemas.microsoft.com/office/2019/extlst" xmlns:r="http://schemas.openxmlformats.org/officeDocument/2006/relationships" xmlns:wp14="http://schemas.microsoft.com/office/word/2010/wordprocessingDrawing" xmlns:wp="http://schemas.openxmlformats.org/drawingml/2006/wordprocessingDrawing" xmlns:wpg="http://schemas.microsoft.com/office/word/2010/wordprocessingGroup" xmlns:wpi="http://schemas.microsoft.com/office/word/2010/wordprocessingInk" xmlns:wps="http://schemas.microsoft.com/office/word/2010/wordprocessingShape" xmlns:o="urn:schemas-microsoft-com:office:office" xmlns:v="urn:schemas-microsoft-com:vml" xmlns:w10="urn:schemas-microsoft-com:office:word" xmlns:w="http://schemas.openxmlformats.org/wordprocessingml/2006/main" xmlns:w14="http://schemas.microsoft.com/office/word/2010/wordml" xmlns:w15="http://schemas.microsoft.com/office/word/2012/wordml" xmlns:w16cex="http://schemas.microsoft.com/office/word/2018/wordml/cex" xmlns:w16cid="http://schemas.microsoft.com/office/word/2016/wordml/cid" xmlns:w16="http://schemas.microsoft.com/office/word/2018/wordml" xmlns:w16sdtdh="http://schemas.microsoft.com/office/word/2020/wordml/sdtdatahash" xmlns:w16sdtfl="http://schemas.microsoft.com/office/word/2024/wordml/sdtformatlock" xmlns:w16se="http://schemas.microsoft.com/office/word/2015/wordml/symex" xmlns:w16du="http://schemas.microsoft.com/office/word/2023/wordml/word16du" xmlns:wne="http://schemas.microsoft.com/office/word/2006/wordml" mc:Ignorable="w14 w15 w16se w16cid w16 w16cex w16sdtdh w16sdtfl w16du wp14">
   <w:body>
     <w:p>
       <w:pPr>
@@ -610,7 +610,7 @@
         </w:rPr>
         <w:t xml:space="preserve"> </w:t>
       </w:r>
-      <w:hyperlink r:id="rId16" w:history="1">
+      <w:hyperlink r:id="rId16" w:anchor="S16" w:history="1">
         <w:r>
           <w:rPr>
             <w:rStyle w:val="Hyperlink"/>
@@ -650,7 +650,7 @@
         </w:rPr>
         <w:t xml:space="preserve"> </w:t>
       </w:r>
-      <w:hyperlink r:id="rId17" w:history="1">
+      <w:hyperlink r:id="rId17" w:anchor="s4" w:history="1">
         <w:r>
           <w:rPr>
             <w:rStyle w:val="Hyperlink"/>
@@ -689,13 +689,127 @@
         </w:rPr>
         <w:t xml:space="preserve"> </w:t>
       </w:r>
-      <w:hyperlink r:id="rId18" w:history="1">
+      <w:hyperlink r:id="rId18" w:anchor="Sec2" w:history="1">
         <w:r>
           <w:rPr>
             <w:rStyle w:val="Hyperlink"/>
             <w:rFonts w:ascii="Aptos" w:hAnsi="Aptos"/>
           </w:rPr>
           <w:t>https://link.springer.com/article/10.1186/s12859-019-3215-5?utm_source=chatgpt.com#Sec2</w:t>
+        </w:r>
+      </w:hyperlink>
+    </w:p>
+    <w:p>
+      <w:pPr>
+        <w:pStyle w:val="NormalWeb"/>
+        <w:numPr>
+          <w:ilvl w:val="0"/>
+          <w:numId w:val="1"/>
+        </w:numPr>
+        <w:rPr>
+          <w:rFonts w:ascii="Aptos" w:hAnsi="Aptos"/>
+        </w:rPr>
+      </w:pPr>
+      <w:r>
+        <w:rPr>
+          <w:rFonts w:ascii="Aptos" w:hAnsi="Aptos"/>
+        </w:rPr>
+        <w:t>Wherever possible, researchers should consider validating and comparing data and annotations from multiple sources to attain more comprehensive and accurate results.</w:t>
+      </w:r>
+      <w:r>
+        <w:rPr>
+          <w:rFonts w:ascii="Aptos" w:hAnsi="Aptos"/>
+        </w:rPr>
+        <w:t xml:space="preserve"> </w:t>
+      </w:r>
+      <w:r>
+        <w:rPr>
+          <w:rFonts w:ascii="Aptos" w:hAnsi="Aptos"/>
+        </w:rPr>
+        <w:sym w:font="Wingdings" w:char="F0E0"/>
+      </w:r>
+      <w:r>
+        <w:rPr>
+          <w:rFonts w:ascii="Aptos" w:hAnsi="Aptos"/>
+        </w:rPr>
+        <w:t xml:space="preserve"> </w:t>
+      </w:r>
+      <w:hyperlink r:id="rId19" w:history="1">
+        <w:r>
+          <w:rPr>
+            <w:rStyle w:val="Hyperlink"/>
+            <w:rFonts w:ascii="Aptos" w:hAnsi="Aptos"/>
+          </w:rPr>
+          <w:t>https://www.nature.com/articles/s41596-024-01020-z</w:t>
+        </w:r>
+      </w:hyperlink>
+    </w:p>
+    <w:p>
+      <w:pPr>
+        <w:pStyle w:val="NormalWeb"/>
+        <w:numPr>
+          <w:ilvl w:val="0"/>
+          <w:numId w:val="1"/>
+        </w:numPr>
+        <w:rPr>
+          <w:rFonts w:ascii="Aptos" w:hAnsi="Aptos"/>
+        </w:rPr>
+      </w:pPr>
+      <w:r>
+        <w:rPr>
+          <w:rFonts w:ascii="Aptos" w:hAnsi="Aptos"/>
+        </w:rPr>
+        <w:t>As such, integrating</w:t>
+      </w:r>
+      <w:r>
+        <w:rPr>
+          <w:rFonts w:ascii="Aptos" w:hAnsi="Aptos"/>
+        </w:rPr>
+        <w:t xml:space="preserve"> </w:t>
+      </w:r>
+      <w:r>
+        <w:rPr>
+          <w:rFonts w:ascii="Aptos" w:hAnsi="Aptos"/>
+        </w:rPr>
+        <w:t>multiple databases and filtering based on validation status</w:t>
+      </w:r>
+      <w:r>
+        <w:rPr>
+          <w:rFonts w:ascii="Aptos" w:hAnsi="Aptos"/>
+        </w:rPr>
+        <w:t xml:space="preserve"> </w:t>
+      </w:r>
+      <w:r>
+        <w:rPr>
+          <w:rFonts w:ascii="Aptos" w:hAnsi="Aptos"/>
+        </w:rPr>
+        <w:t>are recommended</w:t>
+      </w:r>
+      <w:r>
+        <w:rPr>
+          <w:rFonts w:ascii="Aptos" w:hAnsi="Aptos"/>
+        </w:rPr>
+        <w:t xml:space="preserve">. </w:t>
+      </w:r>
+      <w:r>
+        <w:rPr>
+          <w:rFonts w:ascii="Aptos" w:hAnsi="Aptos"/>
+        </w:rPr>
+        <w:sym w:font="Wingdings" w:char="F0E0"/>
+      </w:r>
+      <w:r>
+        <w:rPr>
+          <w:rFonts w:ascii="Aptos" w:hAnsi="Aptos"/>
+        </w:rPr>
+        <w:t xml:space="preserve"> </w:t>
+      </w:r>
+      <w:hyperlink r:id="rId20" w:history="1">
+        <w:r>
+          <w:rPr>
+            <w:rStyle w:val="Hyperlink"/>
+            <w:rFonts w:ascii="Aptos" w:hAnsi="Aptos"/>
+          </w:rPr>
+          <w:t>https://www.jove.com/pdf/68760/a-verified-workflow-for-mirnaseq-data-processing-and-bioinformatics-analysis-using-r</w:t>
         </w:r>
       </w:hyperlink>
     </w:p>
@@ -747,7 +861,7 @@
 </file>
 
 <file path=word/numbering.xml><?xml version="1.0" encoding="utf-8"?>
-<w:numbering xmlns:wpc="http://schemas.microsoft.com/office/word/2010/wordprocessingCanvas" xmlns:cx="http://schemas.microsoft.com/office/drawing/2014/chartex" xmlns:cx1="http://schemas.microsoft.com/office/drawing/2015/9/8/chartex" xmlns:cx2="http://schemas.microsoft.com/office/drawing/2015/10/21/chartex" xmlns:cx3="http://schemas.microsoft.com/office/drawing/2016/5/9/chartex" xmlns:cx4="http://schemas.microsoft.com/office/drawing/2016/5/10/chartex" xmlns:cx5="http://schemas.microsoft.com/office/drawing/2016/5/11/chartex" xmlns:cx6="http://schemas.microsoft.com/office/drawing/2016/5/12/chartex" xmlns:cx7="http://schemas.microsoft.com/office/drawing/2016/5/13/chartex" xmlns:cx8="http://schemas.microsoft.com/office/drawing/2016/5/14/chartex" xmlns:mc="http://schemas.openxmlformats.org/markup-compatibility/2006" xmlns:aink="http://schemas.microsoft.com/office/drawing/2016/ink" xmlns:am3d="http://schemas.microsoft.com/office/drawing/2017/model3d" xmlns:o="urn:schemas-microsoft-com:office:office" xmlns:oel="http://schemas.microsoft.com/office/2019/extlst" xmlns:r="http://schemas.openxmlformats.org/officeDocument/2006/relationships" xmlns:m="http://schemas.openxmlformats.org/officeDocument/2006/math" xmlns:v="urn:schemas-microsoft-com:vml" xmlns:wp14="http://schemas.microsoft.com/office/word/2010/wordprocessingDrawing" xmlns:wp="http://schemas.openxmlformats.org/drawingml/2006/wordprocessingDrawing" xmlns:w10="urn:schemas-microsoft-com:office:word" xmlns:w="http://schemas.openxmlformats.org/wordprocessingml/2006/main" xmlns:w14="http://schemas.microsoft.com/office/word/2010/wordml" xmlns:w15="http://schemas.microsoft.com/office/word/2012/wordml" xmlns:w16cex="http://schemas.microsoft.com/office/word/2018/wordml/cex" xmlns:w16cid="http://schemas.microsoft.com/office/word/2016/wordml/cid" xmlns:w16="http://schemas.microsoft.com/office/word/2018/wordml" xmlns:w16du="http://schemas.microsoft.com/office/word/2023/wordml/word16du" xmlns:w16sdtdh="http://schemas.microsoft.com/office/word/2020/wordml/sdtdatahash" xmlns:w16sdtfl="http://schemas.microsoft.com/office/word/2024/wordml/sdtformatlock" xmlns:w16se="http://schemas.microsoft.com/office/word/2015/wordml/symex" xmlns:wpg="http://schemas.microsoft.com/office/word/2010/wordprocessingGroup" xmlns:wpi="http://schemas.microsoft.com/office/word/2010/wordprocessingInk" xmlns:wne="http://schemas.microsoft.com/office/word/2006/wordml" xmlns:wps="http://schemas.microsoft.com/office/word/2010/wordprocessingShape" mc:Ignorable="w14 w15 w16se w16cid w16 w16cex w16sdtdh w16sdtfl w16du wp14">
+<w:numbering xmlns:wpc="http://schemas.microsoft.com/office/word/2010/wordprocessingCanvas" xmlns:cx="http://schemas.microsoft.com/office/drawing/2014/chartex" xmlns:cx1="http://schemas.microsoft.com/office/drawing/2015/9/8/chartex" xmlns:cx2="http://schemas.microsoft.com/office/drawing/2015/10/21/chartex" xmlns:cx3="http://schemas.microsoft.com/office/drawing/2016/5/9/chartex" xmlns:cx4="http://schemas.microsoft.com/office/drawing/2016/5/10/chartex" xmlns:cx5="http://schemas.microsoft.com/office/drawing/2016/5/11/chartex" xmlns:cx6="http://schemas.microsoft.com/office/drawing/2016/5/12/chartex" xmlns:cx7="http://schemas.microsoft.com/office/drawing/2016/5/13/chartex" xmlns:cx8="http://schemas.microsoft.com/office/drawing/2016/5/14/chartex" xmlns:mc="http://schemas.openxmlformats.org/markup-compatibility/2006" xmlns:m="http://schemas.openxmlformats.org/officeDocument/2006/math" xmlns:aink="http://schemas.microsoft.com/office/drawing/2016/ink" xmlns:am3d="http://schemas.microsoft.com/office/drawing/2017/model3d" xmlns:oel="http://schemas.microsoft.com/office/2019/extlst" xmlns:r="http://schemas.openxmlformats.org/officeDocument/2006/relationships" xmlns:wp14="http://schemas.microsoft.com/office/word/2010/wordprocessingDrawing" xmlns:wp="http://schemas.openxmlformats.org/drawingml/2006/wordprocessingDrawing" xmlns:wpg="http://schemas.microsoft.com/office/word/2010/wordprocessingGroup" xmlns:wpi="http://schemas.microsoft.com/office/word/2010/wordprocessingInk" xmlns:wps="http://schemas.microsoft.com/office/word/2010/wordprocessingShape" xmlns:o="urn:schemas-microsoft-com:office:office" xmlns:v="urn:schemas-microsoft-com:vml" xmlns:w10="urn:schemas-microsoft-com:office:word" xmlns:w="http://schemas.openxmlformats.org/wordprocessingml/2006/main" xmlns:w14="http://schemas.microsoft.com/office/word/2010/wordml" xmlns:w15="http://schemas.microsoft.com/office/word/2012/wordml" xmlns:w16cex="http://schemas.microsoft.com/office/word/2018/wordml/cex" xmlns:w16cid="http://schemas.microsoft.com/office/word/2016/wordml/cid" xmlns:w16="http://schemas.microsoft.com/office/word/2018/wordml" xmlns:w16sdtdh="http://schemas.microsoft.com/office/word/2020/wordml/sdtdatahash" xmlns:w16sdtfl="http://schemas.microsoft.com/office/word/2024/wordml/sdtformatlock" xmlns:w16se="http://schemas.microsoft.com/office/word/2015/wordml/symex" xmlns:w16du="http://schemas.microsoft.com/office/word/2023/wordml/word16du" xmlns:wne="http://schemas.microsoft.com/office/word/2006/wordml" mc:Ignorable="w14 w15 w16se w16cid w16 w16cex w16sdtdh w16sdtfl w16du wp14">
   <w:abstractNum w:abstractNumId="0" w15:restartNumberingAfterBreak="0">
     <w:nsid w:val="377E133E"/>
     <w:multiLevelType w:val="hybridMultilevel"/>
@@ -1020,7 +1134,7 @@
 </file>
 
 <file path=word/styles.xml><?xml version="1.0" encoding="utf-8"?>
-<w:styles xmlns:mc="http://schemas.openxmlformats.org/markup-compatibility/2006" xmlns:r="http://schemas.openxmlformats.org/officeDocument/2006/relationships" xmlns:w="http://schemas.openxmlformats.org/wordprocessingml/2006/main" xmlns:w14="http://schemas.microsoft.com/office/word/2010/wordml" xmlns:w15="http://schemas.microsoft.com/office/word/2012/wordml" xmlns:w16cex="http://schemas.microsoft.com/office/word/2018/wordml/cex" xmlns:w16cid="http://schemas.microsoft.com/office/word/2016/wordml/cid" xmlns:w16="http://schemas.microsoft.com/office/word/2018/wordml" xmlns:w16du="http://schemas.microsoft.com/office/word/2023/wordml/word16du" xmlns:w16sdtdh="http://schemas.microsoft.com/office/word/2020/wordml/sdtdatahash" xmlns:w16sdtfl="http://schemas.microsoft.com/office/word/2024/wordml/sdtformatlock" xmlns:w16se="http://schemas.microsoft.com/office/word/2015/wordml/symex" mc:Ignorable="w14 w15 w16se w16cid w16 w16cex w16sdtdh w16sdtfl w16du">
+<w:styles xmlns:mc="http://schemas.openxmlformats.org/markup-compatibility/2006" xmlns:r="http://schemas.openxmlformats.org/officeDocument/2006/relationships" xmlns:w="http://schemas.openxmlformats.org/wordprocessingml/2006/main" xmlns:w14="http://schemas.microsoft.com/office/word/2010/wordml" xmlns:w15="http://schemas.microsoft.com/office/word/2012/wordml" xmlns:w16cex="http://schemas.microsoft.com/office/word/2018/wordml/cex" xmlns:w16cid="http://schemas.microsoft.com/office/word/2016/wordml/cid" xmlns:w16="http://schemas.microsoft.com/office/word/2018/wordml" xmlns:w16sdtdh="http://schemas.microsoft.com/office/word/2020/wordml/sdtdatahash" xmlns:w16sdtfl="http://schemas.microsoft.com/office/word/2024/wordml/sdtformatlock" xmlns:w16se="http://schemas.microsoft.com/office/word/2015/wordml/symex" xmlns:w16du="http://schemas.microsoft.com/office/word/2023/wordml/word16du" mc:Ignorable="w14 w15 w16se w16cid w16 w16cex w16sdtdh w16sdtfl w16du">
   <w:docDefaults>
     <w:rPrDefault>
       <w:rPr>

</xml_diff>